<commit_message>
Feat: BaseResponse for mediator and update mediator documentaion
</commit_message>
<xml_diff>
--- a/Documents/Mediator/RWMS_Mediator_Developer_Guide_FA.docx
+++ b/Documents/Mediator/RWMS_Mediator_Developer_Guide_FA.docx
@@ -31,7 +31,7 @@
           <w:sz w:val="24"/>
           <w:rtl w:val="1"/>
         </w:rPr>
-        <w:t>راهنمای استفاده و توسعه برای برنامه‌نویس پروژه</w:t>
+        <w:t>راهنمای استفاده و توسعه برای برنامه‌نویس پروژه — نسخه Generic و Type-Safe</w:t>
       </w:r>
     </w:p>
     <w:tbl>
@@ -45,6 +45,9 @@
         <w:gridCol w:w="10482"/>
       </w:tblGrid>
       <w:tr>
+        <w:trPr>
+          <w:cantSplit/>
+        </w:trPr>
         <w:tc>
           <w:tcPr>
             <w:tcW w:type="dxa" w:w="8220"/>
@@ -144,6 +147,9 @@
         <w:gridCol w:w="5241"/>
       </w:tblGrid>
       <w:tr>
+        <w:trPr>
+          <w:cantSplit/>
+        </w:trPr>
         <w:tc>
           <w:tcPr>
             <w:tcW w:type="dxa" w:w="680"/>
@@ -205,6 +211,9 @@
         </w:tc>
       </w:tr>
       <w:tr>
+        <w:trPr>
+          <w:cantSplit/>
+        </w:trPr>
         <w:tc>
           <w:tcPr>
             <w:tcW w:type="dxa" w:w="680"/>
@@ -260,12 +269,15 @@
                 <w:color w:val="263238"/>
                 <w:rtl w:val="1"/>
               </w:rPr>
-              <w:t>افزودن Command یا Query جدید</w:t>
+              <w:t>افزودن Command یا Query جدید همراه با IRequest[TResponse] و Type Flow</w:t>
             </w:r>
           </w:p>
         </w:tc>
       </w:tr>
       <w:tr>
+        <w:trPr>
+          <w:cantSplit/>
+        </w:trPr>
         <w:tc>
           <w:tcPr>
             <w:tcW w:type="dxa" w:w="680"/>
@@ -327,6 +339,9 @@
         </w:tc>
       </w:tr>
       <w:tr>
+        <w:trPr>
+          <w:cantSplit/>
+        </w:trPr>
         <w:tc>
           <w:tcPr>
             <w:tcW w:type="dxa" w:w="680"/>
@@ -388,6 +403,9 @@
         </w:tc>
       </w:tr>
       <w:tr>
+        <w:trPr>
+          <w:cantSplit/>
+        </w:trPr>
         <w:tc>
           <w:tcPr>
             <w:tcW w:type="dxa" w:w="680"/>
@@ -449,6 +467,9 @@
         </w:tc>
       </w:tr>
       <w:tr>
+        <w:trPr>
+          <w:cantSplit/>
+        </w:trPr>
         <w:tc>
           <w:tcPr>
             <w:tcW w:type="dxa" w:w="680"/>
@@ -510,6 +531,9 @@
         </w:tc>
       </w:tr>
       <w:tr>
+        <w:trPr>
+          <w:cantSplit/>
+        </w:trPr>
         <w:tc>
           <w:tcPr>
             <w:tcW w:type="dxa" w:w="680"/>
@@ -571,6 +595,9 @@
         </w:tc>
       </w:tr>
       <w:tr>
+        <w:trPr>
+          <w:cantSplit/>
+        </w:trPr>
         <w:tc>
           <w:tcPr>
             <w:tcW w:type="dxa" w:w="680"/>
@@ -632,6 +659,9 @@
         </w:tc>
       </w:tr>
       <w:tr>
+        <w:trPr>
+          <w:cantSplit/>
+        </w:trPr>
         <w:tc>
           <w:tcPr>
             <w:tcW w:type="dxa" w:w="680"/>
@@ -693,6 +723,9 @@
         </w:tc>
       </w:tr>
       <w:tr>
+        <w:trPr>
+          <w:cantSplit/>
+        </w:trPr>
         <w:tc>
           <w:tcPr>
             <w:tcW w:type="dxa" w:w="680"/>
@@ -788,7 +821,7 @@
           <w:color w:val="263238"/>
           <w:rtl w:val="1"/>
         </w:rPr>
-        <w:t>Mediator نقطه واسط بین Controller و منطق Use Case است. Controller فقط Request مناسب را می‌سازد و آن را برای Mediator می‌فرستد؛ Mediator بر اساس نوع Request، Handler و Behaviorهای لازم را اجرا می‌کند.</w:t>
+        <w:t>Mediator نقطه واسط بین Controller و منطق Use Case است. Controller فقط Request مناسب را می‌سازد و آن را برای Mediator می‌فرستد؛ هر Request با IRequest[TResponse] نوع خروجی خود را نیز مشخص می‌کند. Mediator بر اساس نوع Request، Handler و Behaviorهای لازم را اجرا می‌کند و همان TResponse را به Controller برمی‌گرداند.</w:t>
       </w:r>
     </w:p>
     <w:tbl>
@@ -807,6 +840,9 @@
         <w:gridCol w:w="1747"/>
       </w:tblGrid>
       <w:tr>
+        <w:trPr>
+          <w:cantSplit/>
+        </w:trPr>
         <w:tc>
           <w:tcPr>
             <w:tcW w:type="dxa" w:w="1606"/>
@@ -1007,7 +1043,7 @@
                 <w:sz w:val="17"/>
                 <w:rtl w:val="1"/>
               </w:rPr>
-              <w:t>Result</w:t>
+              <w:t>TResponse</w:t>
             </w:r>
           </w:p>
         </w:tc>
@@ -1024,6 +1060,9 @@
         <w:gridCol w:w="10482"/>
       </w:tblGrid>
       <w:tr>
+        <w:trPr>
+          <w:cantSplit/>
+        </w:trPr>
         <w:tc>
           <w:tcPr>
             <w:tcW w:type="dxa" w:w="10482"/>
@@ -1084,6 +1123,9 @@
         <w:gridCol w:w="5241"/>
       </w:tblGrid>
       <w:tr>
+        <w:trPr>
+          <w:cantSplit/>
+        </w:trPr>
         <w:tc>
           <w:tcPr>
             <w:tcW w:type="dxa" w:w="5241"/>
@@ -1140,6 +1182,9 @@
         </w:tc>
       </w:tr>
       <w:tr>
+        <w:trPr>
+          <w:cantSplit/>
+        </w:trPr>
         <w:tc>
           <w:tcPr>
             <w:tcW w:type="dxa" w:w="2835"/>
@@ -1190,12 +1235,74 @@
                 <w:color w:val="263238"/>
                 <w:rtl w:val="1"/>
               </w:rPr>
-              <w:t>ورودی اصلی سیستم در Controller؛ متد send(request) را در اختیار می‌گذارد.</w:t>
+              <w:t>ورودی اصلی سیستم در Controller؛ send(request) را اجرا می‌کند و TResponse همان Request را برمی‌گرداند.</w:t>
             </w:r>
           </w:p>
         </w:tc>
       </w:tr>
       <w:tr>
+        <w:trPr>
+          <w:cantSplit/>
+        </w:trPr>
+        <w:tc>
+          <w:tcPr>
+            <w:tcW w:type="dxa" w:w="2835"/>
+            <w:tcMar>
+              <w:top w:w="100" w:type="dxa"/>
+              <w:start w:w="120" w:type="dxa"/>
+              <w:bottom w:w="100" w:type="dxa"/>
+              <w:end w:w="120" w:type="dxa"/>
+            </w:tcMar>
+            <w:shd w:fill="FBFCFC"/>
+          </w:tcPr>
+          <w:p>
+            <w:pPr>
+              <w:bidi w:val="1"/>
+              <w:jc w:val="right"/>
+            </w:pPr>
+            <w:r>
+              <w:rPr>
+                <w:rFonts w:ascii="Noto Sans Arabic" w:hAnsi="Noto Sans Arabic" w:cs="Noto Sans Arabic" w:eastAsia="Noto Sans Arabic"/>
+                <w:b/>
+                <w:color w:val="263238"/>
+                <w:rtl w:val="1"/>
+              </w:rPr>
+              <w:t>IRequest[TResponse]</w:t>
+            </w:r>
+          </w:p>
+        </w:tc>
+        <w:tc>
+          <w:tcPr>
+            <w:tcW w:type="dxa" w:w="6520"/>
+            <w:tcMar>
+              <w:top w:w="100" w:type="dxa"/>
+              <w:start w:w="120" w:type="dxa"/>
+              <w:bottom w:w="100" w:type="dxa"/>
+              <w:end w:w="120" w:type="dxa"/>
+            </w:tcMar>
+            <w:shd w:fill="FBFCFC"/>
+          </w:tcPr>
+          <w:p>
+            <w:pPr>
+              <w:bidi w:val="1"/>
+              <w:jc w:val="right"/>
+            </w:pPr>
+            <w:r>
+              <w:rPr>
+                <w:rFonts w:ascii="Noto Sans Arabic" w:hAnsi="Noto Sans Arabic" w:cs="Noto Sans Arabic" w:eastAsia="Noto Sans Arabic"/>
+                <w:b w:val="0"/>
+                <w:color w:val="263238"/>
+                <w:rtl w:val="1"/>
+              </w:rPr>
+              <w:t>قرارداد Request تایپ‌سیف؛ هر Command/Query از طریق TResponse اعلام می‌کند mediator.send(...) چه نوع خروجی‌ای دارد.</w:t>
+            </w:r>
+          </w:p>
+        </w:tc>
+      </w:tr>
+      <w:tr>
+        <w:trPr>
+          <w:cantSplit/>
+        </w:trPr>
         <w:tc>
           <w:tcPr>
             <w:tcW w:type="dxa" w:w="2835"/>
@@ -1246,12 +1353,15 @@
                 <w:color w:val="263238"/>
                 <w:rtl w:val="1"/>
               </w:rPr>
-              <w:t>قرارداد Handler؛ مشخص می‌کند Handler چه Requestی می‌گیرد و چه Resultی برمی‌گرداند.</w:t>
+              <w:t>قرارداد Handler؛ نوع Request و نوع Result/Response را به‌صورت Generic مشخص می‌کند.</w:t>
             </w:r>
           </w:p>
         </w:tc>
       </w:tr>
       <w:tr>
+        <w:trPr>
+          <w:cantSplit/>
+        </w:trPr>
         <w:tc>
           <w:tcPr>
             <w:tcW w:type="dxa" w:w="2835"/>
@@ -1308,6 +1418,9 @@
         </w:tc>
       </w:tr>
       <w:tr>
+        <w:trPr>
+          <w:cantSplit/>
+        </w:trPr>
         <w:tc>
           <w:tcPr>
             <w:tcW w:type="dxa" w:w="2835"/>
@@ -1364,6 +1477,9 @@
         </w:tc>
       </w:tr>
       <w:tr>
+        <w:trPr>
+          <w:cantSplit/>
+        </w:trPr>
         <w:tc>
           <w:tcPr>
             <w:tcW w:type="dxa" w:w="2835"/>
@@ -1420,6 +1536,9 @@
         </w:tc>
       </w:tr>
       <w:tr>
+        <w:trPr>
+          <w:cantSplit/>
+        </w:trPr>
         <w:tc>
           <w:tcPr>
             <w:tcW w:type="dxa" w:w="2835"/>
@@ -1510,7 +1629,7 @@
           <w:color w:val="263238"/>
           <w:rtl w:val="1"/>
         </w:rPr>
-        <w:t>هر Use Case یک Request مشخص دارد. برای عملیات تغییردهنده داده معمولاً COMMAND و برای خواندن داده معمولاً QUERY استفاده می‌شود.</w:t>
+        <w:t>هر Use Case یک Request مشخص دارد. Request علاوه بر داده‌های موردنیاز Use Case، نوع خروجی خود را نیز با IRequest[TResponse] اعلام می‌کند. برای عملیات تغییردهنده داده معمولاً COMMAND و برای خواندن داده معمولاً QUERY استفاده می‌شود.</w:t>
       </w:r>
     </w:p>
     <w:p>
@@ -1555,7 +1674,7 @@
           <w:color w:val="263238"/>
           <w:rtl w:val="1"/>
         </w:rPr>
-        <w:t>•  Request فقط داده موردنیاز Use Case را حمل می‌کند و منطق اصلی در Handler قرار می‌گیرد.</w:t>
+        <w:t>•  Request داده موردنیاز Use Case را حمل می‌کند و با IRequest[TResponse] نوع Response را برای Type Checker مشخص می‌کند؛ منطق اصلی در Handler قرار می‌گیرد.</w:t>
       </w:r>
     </w:p>
     <w:tbl>
@@ -1569,6 +1688,9 @@
         <w:gridCol w:w="10482"/>
       </w:tblGrid>
       <w:tr>
+        <w:trPr>
+          <w:cantSplit/>
+        </w:trPr>
         <w:tc>
           <w:tcPr>
             <w:tcW w:type="dxa" w:w="10482"/>
@@ -1596,45 +1718,19 @@
               <w:rPr>
                 <w:rFonts w:ascii="DejaVu Sans Mono" w:hAnsi="DejaVu Sans Mono" w:cs="DejaVu Sans Mono" w:eastAsia="DejaVu Sans Mono"/>
                 <w:color w:val="2E3436"/>
-                <w:sz w:val="16"/>
+                <w:sz w:val="17"/>
                 <w:rtl w:val="0"/>
               </w:rPr>
               <w:t>@request_type(RequestType.COMMAND)</w:t>
-            </w:r>
-            <w:r>
               <w:br/>
-            </w:r>
-            <w:r>
-              <w:rPr>
-                <w:rFonts w:ascii="DejaVu Sans Mono" w:hAnsi="DejaVu Sans Mono" w:cs="DejaVu Sans Mono" w:eastAsia="DejaVu Sans Mono"/>
-                <w:color w:val="2E3436"/>
-                <w:sz w:val="16"/>
-                <w:rtl w:val="0"/>
-              </w:rPr>
               <w:t>@dataclass(frozen=True, slots=True)</w:t>
-            </w:r>
-            <w:r>
               <w:br/>
-            </w:r>
-            <w:r>
-              <w:rPr>
-                <w:rFonts w:ascii="DejaVu Sans Mono" w:hAnsi="DejaVu Sans Mono" w:cs="DejaVu Sans Mono" w:eastAsia="DejaVu Sans Mono"/>
-                <w:color w:val="2E3436"/>
-                <w:sz w:val="16"/>
-                <w:rtl w:val="0"/>
-              </w:rPr>
-              <w:t>class CreateUserCommand:</w:t>
-            </w:r>
-            <w:r>
+              <w:t>class CreateUserCommand(</w:t>
               <w:br/>
-            </w:r>
-            <w:r>
-              <w:rPr>
-                <w:rFonts w:ascii="DejaVu Sans Mono" w:hAnsi="DejaVu Sans Mono" w:cs="DejaVu Sans Mono" w:eastAsia="DejaVu Sans Mono"/>
-                <w:color w:val="2E3436"/>
-                <w:sz w:val="16"/>
-                <w:rtl w:val="0"/>
-              </w:rPr>
+              <w:t xml:space="preserve">    IRequest[BaseResponse[UserDto]]</w:t>
+              <w:br/>
+              <w:t>):</w:t>
+              <w:br/>
               <w:t xml:space="preserve">    data: UserCustomDto</w:t>
             </w:r>
           </w:p>
@@ -1657,6 +1753,9 @@
         <w:gridCol w:w="10482"/>
       </w:tblGrid>
       <w:tr>
+        <w:trPr>
+          <w:cantSplit/>
+        </w:trPr>
         <w:tc>
           <w:tcPr>
             <w:tcW w:type="dxa" w:w="10482"/>
@@ -1686,15 +1785,7 @@
                 <w:color w:val="3F7C78"/>
                 <w:rtl w:val="1"/>
               </w:rPr>
-              <w:t xml:space="preserve">نکته — </w:t>
-            </w:r>
-            <w:r>
-              <w:rPr>
-                <w:rFonts w:ascii="Noto Sans Arabic" w:hAnsi="Noto Sans Arabic" w:cs="Noto Sans Arabic" w:eastAsia="Noto Sans Arabic"/>
-                <w:color w:val="263238"/>
-                <w:rtl w:val="1"/>
-              </w:rPr>
-              <w:t>اگر @request_type(...) فراموش شود، BehaviorPolicyResolver نمی‌تواند Policy مناسب را تعیین کند.</w:t>
+              <w:t>نکته — دو چیز روی Request مستقل از هم هستند: @request_type(...) Policy اجرایی Command/Query را مشخص می‌کند؛ IRequest[TResponse] نوع خروجی را برای Type Checker مشخص می‌کند. هر دو لازم‌اند.</w:t>
             </w:r>
           </w:p>
         </w:tc>
@@ -1734,7 +1825,7 @@
           <w:color w:val="263238"/>
           <w:rtl w:val="1"/>
         </w:rPr>
-        <w:t>برای هر Request فقط Handler مربوط به همان Use Case را تعریف کنید. ارتباط Request و Handler با @handler_for(...) مشخص می‌شود و Loader آن را به Registry معرفی می‌کند.</w:t>
+        <w:t>برای هر Request فقط Handler مربوط به همان Use Case را تعریف کنید. ارتباط Request و Handler با @handler_for(...) مشخص می‌شود و Loader آن را به Registry معرفی می‌کند. نوع خروجی Handler باید با TResponse تعریف‌شده روی IRequest همان Request هماهنگ باشد.</w:t>
       </w:r>
     </w:p>
     <w:tbl>
@@ -1748,6 +1839,9 @@
         <w:gridCol w:w="10482"/>
       </w:tblGrid>
       <w:tr>
+        <w:trPr>
+          <w:cantSplit/>
+        </w:trPr>
         <w:tc>
           <w:tcPr>
             <w:tcW w:type="dxa" w:w="10482"/>
@@ -1775,141 +1869,75 @@
               <w:rPr>
                 <w:rFonts w:ascii="DejaVu Sans Mono" w:hAnsi="DejaVu Sans Mono" w:cs="DejaVu Sans Mono" w:eastAsia="DejaVu Sans Mono"/>
                 <w:color w:val="2E3436"/>
-                <w:sz w:val="16"/>
+                <w:sz w:val="17"/>
                 <w:rtl w:val="0"/>
               </w:rPr>
               <w:t>@handler_for(CreateUserCommand)</w:t>
-            </w:r>
-            <w:r>
               <w:br/>
-            </w:r>
-            <w:r>
-              <w:rPr>
-                <w:rFonts w:ascii="DejaVu Sans Mono" w:hAnsi="DejaVu Sans Mono" w:cs="DejaVu Sans Mono" w:eastAsia="DejaVu Sans Mono"/>
-                <w:color w:val="2E3436"/>
-                <w:sz w:val="16"/>
-                <w:rtl w:val="0"/>
-              </w:rPr>
               <w:t>class CreateUserCommandHandler(</w:t>
-            </w:r>
-            <w:r>
               <w:br/>
-            </w:r>
-            <w:r>
-              <w:rPr>
-                <w:rFonts w:ascii="DejaVu Sans Mono" w:hAnsi="DejaVu Sans Mono" w:cs="DejaVu Sans Mono" w:eastAsia="DejaVu Sans Mono"/>
-                <w:color w:val="2E3436"/>
-                <w:sz w:val="16"/>
-                <w:rtl w:val="0"/>
-              </w:rPr>
-              <w:t xml:space="preserve">    IRequestHandler[CreateUserCommand, User]</w:t>
-            </w:r>
-            <w:r>
+              <w:t xml:space="preserve">    IRequestHandler[</w:t>
               <w:br/>
-            </w:r>
-            <w:r>
-              <w:rPr>
-                <w:rFonts w:ascii="DejaVu Sans Mono" w:hAnsi="DejaVu Sans Mono" w:cs="DejaVu Sans Mono" w:eastAsia="DejaVu Sans Mono"/>
-                <w:color w:val="2E3436"/>
-                <w:sz w:val="16"/>
-                <w:rtl w:val="0"/>
-              </w:rPr>
+              <w:t xml:space="preserve">        CreateUserCommand,</w:t>
+              <w:br/>
+              <w:t xml:space="preserve">        BaseResponse[UserDto],</w:t>
+              <w:br/>
+              <w:t xml:space="preserve">    ]</w:t>
+              <w:br/>
               <w:t>):</w:t>
-            </w:r>
-            <w:r>
               <w:br/>
-            </w:r>
-            <w:r>
-              <w:rPr>
-                <w:rFonts w:ascii="DejaVu Sans Mono" w:hAnsi="DejaVu Sans Mono" w:cs="DejaVu Sans Mono" w:eastAsia="DejaVu Sans Mono"/>
-                <w:color w:val="2E3436"/>
-                <w:sz w:val="16"/>
-                <w:rtl w:val="0"/>
-              </w:rPr>
-              <w:t xml:space="preserve">    def __init__(self, uow: IUnitOfWork, mapper: IMapper):</w:t>
-            </w:r>
-            <w:r>
+              <w:t xml:space="preserve">    def __init__(</w:t>
               <w:br/>
-            </w:r>
-            <w:r>
-              <w:rPr>
-                <w:rFonts w:ascii="DejaVu Sans Mono" w:hAnsi="DejaVu Sans Mono" w:cs="DejaVu Sans Mono" w:eastAsia="DejaVu Sans Mono"/>
-                <w:color w:val="2E3436"/>
-                <w:sz w:val="16"/>
-                <w:rtl w:val="0"/>
-              </w:rPr>
+              <w:t xml:space="preserve">        self,</w:t>
+              <w:br/>
+              <w:t xml:space="preserve">        uow: IUnitOfWork,</w:t>
+              <w:br/>
+              <w:t xml:space="preserve">        mapper: IMapper,</w:t>
+              <w:br/>
+              <w:t xml:space="preserve">    ):</w:t>
+              <w:br/>
               <w:t xml:space="preserve">        self._uow = uow</w:t>
-            </w:r>
-            <w:r>
               <w:br/>
-            </w:r>
-            <w:r>
-              <w:rPr>
-                <w:rFonts w:ascii="DejaVu Sans Mono" w:hAnsi="DejaVu Sans Mono" w:cs="DejaVu Sans Mono" w:eastAsia="DejaVu Sans Mono"/>
-                <w:color w:val="2E3436"/>
-                <w:sz w:val="16"/>
-                <w:rtl w:val="0"/>
-              </w:rPr>
               <w:t xml:space="preserve">        self._mapper = mapper</w:t>
-            </w:r>
-            <w:r>
               <w:br/>
-            </w:r>
-            <w:r>
-              <w:rPr>
-                <w:rFonts w:ascii="DejaVu Sans Mono" w:hAnsi="DejaVu Sans Mono" w:cs="DejaVu Sans Mono" w:eastAsia="DejaVu Sans Mono"/>
-                <w:color w:val="2E3436"/>
-                <w:sz w:val="16"/>
-                <w:rtl w:val="0"/>
-              </w:rPr>
-            </w:r>
-            <w:r>
               <w:br/>
-            </w:r>
-            <w:r>
-              <w:rPr>
-                <w:rFonts w:ascii="DejaVu Sans Mono" w:hAnsi="DejaVu Sans Mono" w:cs="DejaVu Sans Mono" w:eastAsia="DejaVu Sans Mono"/>
-                <w:color w:val="2E3436"/>
-                <w:sz w:val="16"/>
-                <w:rtl w:val="0"/>
-              </w:rPr>
-              <w:t xml:space="preserve">    async def handle(self, request: CreateUserCommand) -&gt; User:</w:t>
-            </w:r>
-            <w:r>
+              <w:t xml:space="preserve">    async def handle(</w:t>
               <w:br/>
-            </w:r>
-            <w:r>
-              <w:rPr>
-                <w:rFonts w:ascii="DejaVu Sans Mono" w:hAnsi="DejaVu Sans Mono" w:cs="DejaVu Sans Mono" w:eastAsia="DejaVu Sans Mono"/>
-                <w:color w:val="2E3436"/>
-                <w:sz w:val="16"/>
-                <w:rtl w:val="0"/>
-              </w:rPr>
-              <w:t xml:space="preserve">        user = self._mapper.map(request.data, User)</w:t>
-            </w:r>
-            <w:r>
+              <w:t xml:space="preserve">        self,</w:t>
               <w:br/>
-            </w:r>
-            <w:r>
-              <w:rPr>
-                <w:rFonts w:ascii="DejaVu Sans Mono" w:hAnsi="DejaVu Sans Mono" w:cs="DejaVu Sans Mono" w:eastAsia="DejaVu Sans Mono"/>
-                <w:color w:val="2E3436"/>
-                <w:sz w:val="16"/>
-                <w:rtl w:val="0"/>
-              </w:rPr>
+              <w:t xml:space="preserve">        request: CreateUserCommand,</w:t>
+              <w:br/>
+              <w:t xml:space="preserve">    ) -&gt; BaseResponse[UserDto]:</w:t>
+              <w:br/>
+              <w:br/>
+              <w:t xml:space="preserve">        user = self._mapper.map(</w:t>
+              <w:br/>
+              <w:t xml:space="preserve">            request.data,</w:t>
+              <w:br/>
+              <w:t xml:space="preserve">            User,</w:t>
+              <w:br/>
+              <w:t xml:space="preserve">        )</w:t>
+              <w:br/>
+              <w:br/>
               <w:t xml:space="preserve">        await self._uow.users.add(user)</w:t>
-            </w:r>
-            <w:r>
               <w:br/>
-            </w:r>
-            <w:r>
-              <w:rPr>
-                <w:rFonts w:ascii="DejaVu Sans Mono" w:hAnsi="DejaVu Sans Mono" w:cs="DejaVu Sans Mono" w:eastAsia="DejaVu Sans Mono"/>
-                <w:color w:val="2E3436"/>
-                <w:sz w:val="16"/>
-                <w:rtl w:val="0"/>
-              </w:rPr>
-              <w:t xml:space="preserve">        return user</w:t>
+              <w:br/>
+              <w:t xml:space="preserve">        user_dto = self._mapper.map(</w:t>
+              <w:br/>
+              <w:t xml:space="preserve">            user,</w:t>
+              <w:br/>
+              <w:t xml:space="preserve">            UserDto,</w:t>
+              <w:br/>
+              <w:t xml:space="preserve">        )</w:t>
+              <w:br/>
+              <w:br/>
+              <w:t xml:space="preserve">        return BaseResponse[UserDto].success(</w:t>
+              <w:br/>
+              <w:t xml:space="preserve">            data=user_dto,</w:t>
+              <w:br/>
+              <w:t xml:space="preserve">            message="User created successfully.",</w:t>
+              <w:br/>
+              <w:t xml:space="preserve">        )</w:t>
             </w:r>
           </w:p>
         </w:tc>
@@ -1932,6 +1960,9 @@
         <w:gridCol w:w="5241"/>
       </w:tblGrid>
       <w:tr>
+        <w:trPr>
+          <w:cantSplit/>
+        </w:trPr>
         <w:tc>
           <w:tcPr>
             <w:tcW w:type="dxa" w:w="5241"/>
@@ -1988,6 +2019,9 @@
         </w:tc>
       </w:tr>
       <w:tr>
+        <w:trPr>
+          <w:cantSplit/>
+        </w:trPr>
         <w:tc>
           <w:tcPr>
             <w:tcW w:type="dxa" w:w="2835"/>
@@ -2044,6 +2078,9 @@
         </w:tc>
       </w:tr>
       <w:tr>
+        <w:trPr>
+          <w:cantSplit/>
+        </w:trPr>
         <w:tc>
           <w:tcPr>
             <w:tcW w:type="dxa" w:w="2835"/>
@@ -2067,7 +2104,7 @@
                 <w:color w:val="263238"/>
                 <w:rtl w:val="1"/>
               </w:rPr>
-              <w:t>IRequestHandler[Request, Result]</w:t>
+              <w:t>IRequestHandler[Request, TResponse]</w:t>
             </w:r>
           </w:p>
         </w:tc>
@@ -2094,12 +2131,15 @@
                 <w:color w:val="263238"/>
                 <w:rtl w:val="1"/>
               </w:rPr>
-              <w:t>نوع ورودی و خروجی Handler را روشن می‌کند.</w:t>
+              <w:t>نوع ورودی و خروجی Handler را روشن می‌کند؛ TResponse باید با IRequest[TResponse] همان Request هماهنگ باشد.</w:t>
             </w:r>
           </w:p>
         </w:tc>
       </w:tr>
       <w:tr>
+        <w:trPr>
+          <w:cantSplit/>
+        </w:trPr>
         <w:tc>
           <w:tcPr>
             <w:tcW w:type="dxa" w:w="2835"/>
@@ -2156,6 +2196,9 @@
         </w:tc>
       </w:tr>
       <w:tr>
+        <w:trPr>
+          <w:cantSplit/>
+        </w:trPr>
         <w:tc>
           <w:tcPr>
             <w:tcW w:type="dxa" w:w="2835"/>
@@ -2206,7 +2249,7 @@
                 <w:color w:val="263238"/>
                 <w:rtl w:val="1"/>
               </w:rPr>
-              <w:t>منطق Use Case را اجرا می‌کند و نتیجه را برمی‌گرداند.</w:t>
+              <w:t>منطق Use Case را اجرا می‌کند و همان TResponse تعریف‌شده را برمی‌گرداند.</w:t>
             </w:r>
           </w:p>
         </w:tc>
@@ -2228,6 +2271,9 @@
         <w:gridCol w:w="10482"/>
       </w:tblGrid>
       <w:tr>
+        <w:trPr>
+          <w:cantSplit/>
+        </w:trPr>
         <w:tc>
           <w:tcPr>
             <w:tcW w:type="dxa" w:w="10482"/>
@@ -2319,6 +2365,9 @@
         <w:gridCol w:w="10482"/>
       </w:tblGrid>
       <w:tr>
+        <w:trPr>
+          <w:cantSplit/>
+        </w:trPr>
         <w:tc>
           <w:tcPr>
             <w:tcW w:type="dxa" w:w="10482"/>
@@ -2458,6 +2507,9 @@
         <w:gridCol w:w="10482"/>
       </w:tblGrid>
       <w:tr>
+        <w:trPr>
+          <w:cantSplit/>
+        </w:trPr>
         <w:tc>
           <w:tcPr>
             <w:tcW w:type="dxa" w:w="10482"/>
@@ -2535,7 +2587,7 @@
           <w:color w:val="263238"/>
           <w:rtl w:val="1"/>
         </w:rPr>
-        <w:t>در Endpoint فقط MediatorDependency را دریافت کنید، Request مناسب را بسازید و send را صدا بزنید.</w:t>
+        <w:t>در Endpoint فقط MediatorDependency را دریافت کنید، Request مناسب را بسازید و send را صدا بزنید. اگر Request به‌صورت IRequest[TResponse] تعریف شده باشد، IDE/Pylance نوع result را از روی همان TResponse تشخیص می‌دهد.</w:t>
       </w:r>
     </w:p>
     <w:tbl>
@@ -2549,6 +2601,9 @@
         <w:gridCol w:w="10482"/>
       </w:tblGrid>
       <w:tr>
+        <w:trPr>
+          <w:cantSplit/>
+        </w:trPr>
         <w:tc>
           <w:tcPr>
             <w:tcW w:type="dxa" w:w="10482"/>
@@ -2576,93 +2631,35 @@
               <w:rPr>
                 <w:rFonts w:ascii="DejaVu Sans Mono" w:hAnsi="DejaVu Sans Mono" w:cs="DejaVu Sans Mono" w:eastAsia="DejaVu Sans Mono"/>
                 <w:color w:val="2E3436"/>
-                <w:sz w:val="16"/>
+                <w:sz w:val="17"/>
                 <w:rtl w:val="0"/>
               </w:rPr>
               <w:t>@router.post('/mediator-test')</w:t>
-            </w:r>
-            <w:r>
               <w:br/>
-            </w:r>
-            <w:r>
-              <w:rPr>
-                <w:rFonts w:ascii="DejaVu Sans Mono" w:hAnsi="DejaVu Sans Mono" w:cs="DejaVu Sans Mono" w:eastAsia="DejaVu Sans Mono"/>
-                <w:color w:val="2E3436"/>
-                <w:sz w:val="16"/>
-                <w:rtl w:val="0"/>
-              </w:rPr>
               <w:t>async def create_user(</w:t>
-            </w:r>
-            <w:r>
               <w:br/>
-            </w:r>
-            <w:r>
-              <w:rPr>
-                <w:rFonts w:ascii="DejaVu Sans Mono" w:hAnsi="DejaVu Sans Mono" w:cs="DejaVu Sans Mono" w:eastAsia="DejaVu Sans Mono"/>
-                <w:color w:val="2E3436"/>
-                <w:sz w:val="16"/>
-                <w:rtl w:val="0"/>
-              </w:rPr>
               <w:t xml:space="preserve">    request: UserCustomDto,</w:t>
-            </w:r>
-            <w:r>
               <w:br/>
-            </w:r>
-            <w:r>
-              <w:rPr>
-                <w:rFonts w:ascii="DejaVu Sans Mono" w:hAnsi="DejaVu Sans Mono" w:cs="DejaVu Sans Mono" w:eastAsia="DejaVu Sans Mono"/>
-                <w:color w:val="2E3436"/>
-                <w:sz w:val="16"/>
-                <w:rtl w:val="0"/>
-              </w:rPr>
               <w:t xml:space="preserve">    mediator: MediatorDependency,</w:t>
-            </w:r>
-            <w:r>
               <w:br/>
-            </w:r>
-            <w:r>
-              <w:rPr>
-                <w:rFonts w:ascii="DejaVu Sans Mono" w:hAnsi="DejaVu Sans Mono" w:cs="DejaVu Sans Mono" w:eastAsia="DejaVu Sans Mono"/>
-                <w:color w:val="2E3436"/>
-                <w:sz w:val="16"/>
-                <w:rtl w:val="0"/>
-              </w:rPr>
               <w:t>):</w:t>
-            </w:r>
-            <w:r>
               <w:br/>
-            </w:r>
-            <w:r>
-              <w:rPr>
-                <w:rFonts w:ascii="DejaVu Sans Mono" w:hAnsi="DejaVu Sans Mono" w:cs="DejaVu Sans Mono" w:eastAsia="DejaVu Sans Mono"/>
-                <w:color w:val="2E3436"/>
-                <w:sz w:val="16"/>
-                <w:rtl w:val="0"/>
-              </w:rPr>
-              <w:t xml:space="preserve">    command = CreateUserCommand(data=request)</w:t>
-            </w:r>
-            <w:r>
+              <w:t xml:space="preserve">    command = CreateUserCommand(</w:t>
               <w:br/>
-            </w:r>
-            <w:r>
-              <w:rPr>
-                <w:rFonts w:ascii="DejaVu Sans Mono" w:hAnsi="DejaVu Sans Mono" w:cs="DejaVu Sans Mono" w:eastAsia="DejaVu Sans Mono"/>
-                <w:color w:val="2E3436"/>
-                <w:sz w:val="16"/>
-                <w:rtl w:val="0"/>
-              </w:rPr>
-              <w:t xml:space="preserve">    result = await mediator.send(command)</w:t>
-            </w:r>
-            <w:r>
+              <w:t xml:space="preserve">        data=request,</w:t>
               <w:br/>
-            </w:r>
-            <w:r>
-              <w:rPr>
-                <w:rFonts w:ascii="DejaVu Sans Mono" w:hAnsi="DejaVu Sans Mono" w:cs="DejaVu Sans Mono" w:eastAsia="DejaVu Sans Mono"/>
-                <w:color w:val="2E3436"/>
-                <w:sz w:val="16"/>
-                <w:rtl w:val="0"/>
-              </w:rPr>
+              <w:t xml:space="preserve">    )</w:t>
+              <w:br/>
+              <w:br/>
+              <w:t xml:space="preserve">    result = await mediator.send(</w:t>
+              <w:br/>
+              <w:t xml:space="preserve">        command</w:t>
+              <w:br/>
+              <w:t xml:space="preserve">    )</w:t>
+              <w:br/>
+              <w:br/>
+              <w:t xml:space="preserve">    # IDE: BaseResponse[UserDto]</w:t>
+              <w:br/>
               <w:t xml:space="preserve">    return result</w:t>
             </w:r>
           </w:p>
@@ -2685,6 +2682,9 @@
         <w:gridCol w:w="10482"/>
       </w:tblGrid>
       <w:tr>
+        <w:trPr>
+          <w:cantSplit/>
+        </w:trPr>
         <w:tc>
           <w:tcPr>
             <w:tcW w:type="dxa" w:w="10482"/>
@@ -2714,15 +2714,7 @@
                 <w:color w:val="9A6A19"/>
                 <w:rtl w:val="1"/>
               </w:rPr>
-              <w:t xml:space="preserve">Scope صحیح — </w:t>
-            </w:r>
-            <w:r>
-              <w:rPr>
-                <w:rFonts w:ascii="Noto Sans Arabic" w:hAnsi="Noto Sans Arabic" w:cs="Noto Sans Arabic" w:eastAsia="Noto Sans Arabic"/>
-                <w:color w:val="263238"/>
-                <w:rtl w:val="1"/>
-              </w:rPr>
-              <w:t>Mediator را Global نکنید. MediatorDependency باید در هر Endpointی که به آن نیاز دارد دریافت شود تا همان UnitOfWork/Session مربوط به همان HTTP Request استفاده شود.</w:t>
+              <w:t>Scope صحیح — Mediator را Global نکنید. MediatorDependency باید در هر Endpointی که به آن نیاز دارد دریافت شود تا همان UnitOfWork/Session مربوط به همان HTTP Request استفاده شود. اگر Hover روی result مقدار Any نشان داد، ابتدا بررسی کنید Request از IRequest[TResponse] ارث برده باشد و امضای IMediator.send و Mediator.send تایپ Generic را حفظ کرده باشند.</w:t>
             </w:r>
           </w:p>
         </w:tc>
@@ -2780,6 +2772,9 @@
         <w:gridCol w:w="2096"/>
       </w:tblGrid>
       <w:tr>
+        <w:trPr>
+          <w:cantSplit/>
+        </w:trPr>
         <w:tc>
           <w:tcPr>
             <w:tcW w:type="dxa" w:w="1928"/>
@@ -2964,6 +2959,9 @@
         <w:gridCol w:w="5241"/>
       </w:tblGrid>
       <w:tr>
+        <w:trPr>
+          <w:cantSplit/>
+        </w:trPr>
         <w:tc>
           <w:tcPr>
             <w:tcW w:type="dxa" w:w="5241"/>
@@ -3020,6 +3018,9 @@
         </w:tc>
       </w:tr>
       <w:tr>
+        <w:trPr>
+          <w:cantSplit/>
+        </w:trPr>
         <w:tc>
           <w:tcPr>
             <w:tcW w:type="dxa" w:w="2835"/>
@@ -3076,6 +3077,9 @@
         </w:tc>
       </w:tr>
       <w:tr>
+        <w:trPr>
+          <w:cantSplit/>
+        </w:trPr>
         <w:tc>
           <w:tcPr>
             <w:tcW w:type="dxa" w:w="2835"/>
@@ -3132,6 +3136,9 @@
         </w:tc>
       </w:tr>
       <w:tr>
+        <w:trPr>
+          <w:cantSplit/>
+        </w:trPr>
         <w:tc>
           <w:tcPr>
             <w:tcW w:type="dxa" w:w="2835"/>
@@ -3188,6 +3195,9 @@
         </w:tc>
       </w:tr>
       <w:tr>
+        <w:trPr>
+          <w:cantSplit/>
+        </w:trPr>
         <w:tc>
           <w:tcPr>
             <w:tcW w:type="dxa" w:w="2835"/>
@@ -3352,6 +3362,9 @@
         <w:gridCol w:w="10482"/>
       </w:tblGrid>
       <w:tr>
+        <w:trPr>
+          <w:cantSplit/>
+        </w:trPr>
         <w:tc>
           <w:tcPr>
             <w:tcW w:type="dxa" w:w="10482"/>
@@ -3379,45 +3392,23 @@
               <w:rPr>
                 <w:rFonts w:ascii="DejaVu Sans Mono" w:hAnsi="DejaVu Sans Mono" w:cs="DejaVu Sans Mono" w:eastAsia="DejaVu Sans Mono"/>
                 <w:color w:val="2E3436"/>
-                <w:sz w:val="16"/>
+                <w:sz w:val="17"/>
                 <w:rtl w:val="0"/>
               </w:rPr>
               <w:t>@behavior(BehaviorType.PERFORMANCE)</w:t>
-            </w:r>
-            <w:r>
               <w:br/>
-            </w:r>
-            <w:r>
-              <w:rPr>
-                <w:rFonts w:ascii="DejaVu Sans Mono" w:hAnsi="DejaVu Sans Mono" w:cs="DejaVu Sans Mono" w:eastAsia="DejaVu Sans Mono"/>
-                <w:color w:val="2E3436"/>
-                <w:sz w:val="16"/>
-                <w:rtl w:val="0"/>
-              </w:rPr>
               <w:t>class PerformanceBehavior(IPipelineBehavior):</w:t>
-            </w:r>
-            <w:r>
               <w:br/>
-            </w:r>
-            <w:r>
-              <w:rPr>
-                <w:rFonts w:ascii="DejaVu Sans Mono" w:hAnsi="DejaVu Sans Mono" w:cs="DejaVu Sans Mono" w:eastAsia="DejaVu Sans Mono"/>
-                <w:color w:val="2E3436"/>
-                <w:sz w:val="16"/>
-                <w:rtl w:val="0"/>
-              </w:rPr>
-              <w:t xml:space="preserve">    async def handle(self, request, next_handler: NextHandler):</w:t>
-            </w:r>
-            <w:r>
+              <w:t xml:space="preserve">    async def handle(</w:t>
               <w:br/>
-            </w:r>
-            <w:r>
-              <w:rPr>
-                <w:rFonts w:ascii="DejaVu Sans Mono" w:hAnsi="DejaVu Sans Mono" w:cs="DejaVu Sans Mono" w:eastAsia="DejaVu Sans Mono"/>
-                <w:color w:val="2E3436"/>
-                <w:sz w:val="16"/>
-                <w:rtl w:val="0"/>
-              </w:rPr>
+              <w:t xml:space="preserve">        self,</w:t>
+              <w:br/>
+              <w:t xml:space="preserve">        request,</w:t>
+              <w:br/>
+              <w:t xml:space="preserve">        next_handler: NextHandler,</w:t>
+              <w:br/>
+              <w:t xml:space="preserve">    ):</w:t>
+              <w:br/>
               <w:t xml:space="preserve">        return await next_handler()</w:t>
             </w:r>
           </w:p>
@@ -3473,6 +3464,9 @@
         <w:gridCol w:w="5241"/>
       </w:tblGrid>
       <w:tr>
+        <w:trPr>
+          <w:cantSplit/>
+        </w:trPr>
         <w:tc>
           <w:tcPr>
             <w:tcW w:type="dxa" w:w="5241"/>
@@ -3529,6 +3523,9 @@
         </w:tc>
       </w:tr>
       <w:tr>
+        <w:trPr>
+          <w:cantSplit/>
+        </w:trPr>
         <w:tc>
           <w:tcPr>
             <w:tcW w:type="dxa" w:w="2835"/>
@@ -3585,6 +3582,9 @@
         </w:tc>
       </w:tr>
       <w:tr>
+        <w:trPr>
+          <w:cantSplit/>
+        </w:trPr>
         <w:tc>
           <w:tcPr>
             <w:tcW w:type="dxa" w:w="2835"/>
@@ -3657,6 +3657,9 @@
         <w:gridCol w:w="10482"/>
       </w:tblGrid>
       <w:tr>
+        <w:trPr>
+          <w:cantSplit/>
+        </w:trPr>
         <w:tc>
           <w:tcPr>
             <w:tcW w:type="dxa" w:w="10482"/>
@@ -3684,104 +3687,32 @@
               <w:rPr>
                 <w:rFonts w:ascii="DejaVu Sans Mono" w:hAnsi="DejaVu Sans Mono" w:cs="DejaVu Sans Mono" w:eastAsia="DejaVu Sans Mono"/>
                 <w:color w:val="2E3436"/>
-                <w:sz w:val="16"/>
+                <w:sz w:val="17"/>
                 <w:rtl w:val="0"/>
               </w:rPr>
               <w:t>@skip_behaviors(BehaviorType.TRANSACTION)</w:t>
-            </w:r>
-            <w:r>
               <w:br/>
-            </w:r>
-            <w:r>
-              <w:rPr>
-                <w:rFonts w:ascii="DejaVu Sans Mono" w:hAnsi="DejaVu Sans Mono" w:cs="DejaVu Sans Mono" w:eastAsia="DejaVu Sans Mono"/>
-                <w:color w:val="2E3436"/>
-                <w:sz w:val="16"/>
-                <w:rtl w:val="0"/>
-              </w:rPr>
               <w:t>@request_type(RequestType.COMMAND)</w:t>
-            </w:r>
-            <w:r>
               <w:br/>
-            </w:r>
-            <w:r>
-              <w:rPr>
-                <w:rFonts w:ascii="DejaVu Sans Mono" w:hAnsi="DejaVu Sans Mono" w:cs="DejaVu Sans Mono" w:eastAsia="DejaVu Sans Mono"/>
-                <w:color w:val="2E3436"/>
-                <w:sz w:val="16"/>
-                <w:rtl w:val="0"/>
-              </w:rPr>
-              <w:t>class SendSmsCommand:</w:t>
-            </w:r>
-            <w:r>
+              <w:t>class SendSmsCommand(</w:t>
               <w:br/>
-            </w:r>
-            <w:r>
-              <w:rPr>
-                <w:rFonts w:ascii="DejaVu Sans Mono" w:hAnsi="DejaVu Sans Mono" w:cs="DejaVu Sans Mono" w:eastAsia="DejaVu Sans Mono"/>
-                <w:color w:val="2E3436"/>
-                <w:sz w:val="16"/>
-                <w:rtl w:val="0"/>
-              </w:rPr>
+              <w:t xml:space="preserve">    IRequest[BaseResponse[None]]</w:t>
+              <w:br/>
+              <w:t>):</w:t>
+              <w:br/>
               <w:t xml:space="preserve">    ...</w:t>
-            </w:r>
-            <w:r>
               <w:br/>
-            </w:r>
-            <w:r>
-              <w:rPr>
-                <w:rFonts w:ascii="DejaVu Sans Mono" w:hAnsi="DejaVu Sans Mono" w:cs="DejaVu Sans Mono" w:eastAsia="DejaVu Sans Mono"/>
-                <w:color w:val="2E3436"/>
-                <w:sz w:val="16"/>
-                <w:rtl w:val="0"/>
-              </w:rPr>
-            </w:r>
-            <w:r>
               <w:br/>
-            </w:r>
-            <w:r>
-              <w:rPr>
-                <w:rFonts w:ascii="DejaVu Sans Mono" w:hAnsi="DejaVu Sans Mono" w:cs="DejaVu Sans Mono" w:eastAsia="DejaVu Sans Mono"/>
-                <w:color w:val="2E3436"/>
-                <w:sz w:val="16"/>
-                <w:rtl w:val="0"/>
-              </w:rPr>
               <w:t>@require_behaviors(BehaviorType.TRANSACTION)</w:t>
-            </w:r>
-            <w:r>
               <w:br/>
-            </w:r>
-            <w:r>
-              <w:rPr>
-                <w:rFonts w:ascii="DejaVu Sans Mono" w:hAnsi="DejaVu Sans Mono" w:cs="DejaVu Sans Mono" w:eastAsia="DejaVu Sans Mono"/>
-                <w:color w:val="2E3436"/>
-                <w:sz w:val="16"/>
-                <w:rtl w:val="0"/>
-              </w:rPr>
               <w:t>@request_type(RequestType.QUERY)</w:t>
-            </w:r>
-            <w:r>
               <w:br/>
-            </w:r>
-            <w:r>
-              <w:rPr>
-                <w:rFonts w:ascii="DejaVu Sans Mono" w:hAnsi="DejaVu Sans Mono" w:cs="DejaVu Sans Mono" w:eastAsia="DejaVu Sans Mono"/>
-                <w:color w:val="2E3436"/>
-                <w:sz w:val="16"/>
-                <w:rtl w:val="0"/>
-              </w:rPr>
-              <w:t>class SpecialQuery:</w:t>
-            </w:r>
-            <w:r>
+              <w:t>class SpecialQuery(</w:t>
               <w:br/>
-            </w:r>
-            <w:r>
-              <w:rPr>
-                <w:rFonts w:ascii="DejaVu Sans Mono" w:hAnsi="DejaVu Sans Mono" w:cs="DejaVu Sans Mono" w:eastAsia="DejaVu Sans Mono"/>
-                <w:color w:val="2E3436"/>
-                <w:sz w:val="16"/>
-                <w:rtl w:val="0"/>
-              </w:rPr>
+              <w:t xml:space="preserve">    IRequest[BaseResponse[SomeDto]]</w:t>
+              <w:br/>
+              <w:t>):</w:t>
+              <w:br/>
               <w:t xml:space="preserve">    ...</w:t>
             </w:r>
           </w:p>
@@ -3804,6 +3735,9 @@
         <w:gridCol w:w="10482"/>
       </w:tblGrid>
       <w:tr>
+        <w:trPr>
+          <w:cantSplit/>
+        </w:trPr>
         <w:tc>
           <w:tcPr>
             <w:tcW w:type="dxa" w:w="10482"/>
@@ -3898,6 +3832,9 @@
         <w:gridCol w:w="2620"/>
       </w:tblGrid>
       <w:tr>
+        <w:trPr>
+          <w:cantSplit/>
+        </w:trPr>
         <w:tc>
           <w:tcPr>
             <w:tcW w:type="dxa" w:w="2409"/>
@@ -4047,6 +3984,9 @@
         <w:gridCol w:w="10482"/>
       </w:tblGrid>
       <w:tr>
+        <w:trPr>
+          <w:cantSplit/>
+        </w:trPr>
         <w:tc>
           <w:tcPr>
             <w:tcW w:type="dxa" w:w="10482"/>
@@ -4153,6 +4093,9 @@
         <w:gridCol w:w="10482"/>
       </w:tblGrid>
       <w:tr>
+        <w:trPr>
+          <w:cantSplit/>
+        </w:trPr>
         <w:tc>
           <w:tcPr>
             <w:tcW w:type="dxa" w:w="10482"/>
@@ -4180,34 +4123,16 @@
               <w:rPr>
                 <w:rFonts w:ascii="DejaVu Sans Mono" w:hAnsi="DejaVu Sans Mono" w:cs="DejaVu Sans Mono" w:eastAsia="DejaVu Sans Mono"/>
                 <w:color w:val="2E3436"/>
-                <w:sz w:val="16"/>
+                <w:sz w:val="17"/>
                 <w:rtl w:val="0"/>
               </w:rPr>
               <w:t>resolver.add(IUnitOfWork, uow)</w:t>
-            </w:r>
-            <w:r>
               <w:br/>
-            </w:r>
-            <w:r>
-              <w:rPr>
-                <w:rFonts w:ascii="DejaVu Sans Mono" w:hAnsi="DejaVu Sans Mono" w:cs="DejaVu Sans Mono" w:eastAsia="DejaVu Sans Mono"/>
-                <w:color w:val="2E3436"/>
-                <w:sz w:val="16"/>
-                <w:rtl w:val="0"/>
-              </w:rPr>
               <w:t>resolver.add(IMapper, mapper)</w:t>
-            </w:r>
-            <w:r>
               <w:br/>
-            </w:r>
-            <w:r>
-              <w:rPr>
-                <w:rFonts w:ascii="DejaVu Sans Mono" w:hAnsi="DejaVu Sans Mono" w:cs="DejaVu Sans Mono" w:eastAsia="DejaVu Sans Mono"/>
-                <w:color w:val="2E3436"/>
-                <w:sz w:val="16"/>
-                <w:rtl w:val="0"/>
-              </w:rPr>
               <w:t>resolver.add(ITokenService, token_service)</w:t>
+              <w:br/>
+              <w:t>resolver.add(IDatabaseRoutineExecutor, routine_executor)</w:t>
             </w:r>
           </w:p>
         </w:tc>
@@ -4306,6 +4231,9 @@
         <w:gridCol w:w="10482"/>
       </w:tblGrid>
       <w:tr>
+        <w:trPr>
+          <w:cantSplit/>
+        </w:trPr>
         <w:tc>
           <w:tcPr>
             <w:tcW w:type="dxa" w:w="10482"/>
@@ -4430,6 +4358,9 @@
         <w:gridCol w:w="10482"/>
       </w:tblGrid>
       <w:tr>
+        <w:trPr>
+          <w:cantSplit/>
+        </w:trPr>
         <w:tc>
           <w:tcPr>
             <w:tcW w:type="dxa" w:w="10482"/>
@@ -4507,6 +4438,9 @@
         <w:gridCol w:w="5241"/>
       </w:tblGrid>
       <w:tr>
+        <w:trPr>
+          <w:cantSplit/>
+        </w:trPr>
         <w:tc>
           <w:tcPr>
             <w:tcW w:type="dxa" w:w="5241"/>
@@ -4563,6 +4497,9 @@
         </w:tc>
       </w:tr>
       <w:tr>
+        <w:trPr>
+          <w:cantSplit/>
+        </w:trPr>
         <w:tc>
           <w:tcPr>
             <w:tcW w:type="dxa" w:w="2835"/>
@@ -4619,6 +4556,9 @@
         </w:tc>
       </w:tr>
       <w:tr>
+        <w:trPr>
+          <w:cantSplit/>
+        </w:trPr>
         <w:tc>
           <w:tcPr>
             <w:tcW w:type="dxa" w:w="2835"/>
@@ -4675,6 +4615,9 @@
         </w:tc>
       </w:tr>
       <w:tr>
+        <w:trPr>
+          <w:cantSplit/>
+        </w:trPr>
         <w:tc>
           <w:tcPr>
             <w:tcW w:type="dxa" w:w="2835"/>
@@ -4731,6 +4674,9 @@
         </w:tc>
       </w:tr>
       <w:tr>
+        <w:trPr>
+          <w:cantSplit/>
+        </w:trPr>
         <w:tc>
           <w:tcPr>
             <w:tcW w:type="dxa" w:w="2835"/>
@@ -4787,6 +4733,9 @@
         </w:tc>
       </w:tr>
       <w:tr>
+        <w:trPr>
+          <w:cantSplit/>
+        </w:trPr>
         <w:tc>
           <w:tcPr>
             <w:tcW w:type="dxa" w:w="2835"/>
@@ -4843,6 +4792,9 @@
         </w:tc>
       </w:tr>
       <w:tr>
+        <w:trPr>
+          <w:cantSplit/>
+        </w:trPr>
         <w:tc>
           <w:tcPr>
             <w:tcW w:type="dxa" w:w="2835"/>
@@ -4898,6 +4850,31 @@
           </w:p>
         </w:tc>
       </w:tr>
+      <w:tr>
+        <w:trPr>
+          <w:cantSplit/>
+        </w:trPr>
+        <w:tc>
+          <w:tcPr>
+            <w:tcW w:type="dxa" w:w="5241"/>
+          </w:tcPr>
+          <w:p>
+            <w:r>
+              <w:t>result در Controller از نوع Any است</w:t>
+            </w:r>
+          </w:p>
+        </w:tc>
+        <w:tc>
+          <w:tcPr>
+            <w:tcW w:type="dxa" w:w="5241"/>
+          </w:tcPr>
+          <w:p>
+            <w:r>
+              <w:t>بررسی کنید Request از IRequest[TResponse] ارث برده باشد و هر دو IMediator.send و Mediator.send امضای request: IRequest[TResponse] -&gt; TResponse داشته باشند.</w:t>
+            </w:r>
+          </w:p>
+        </w:tc>
+      </w:tr>
     </w:tbl>
     <w:p>
       <w:pPr>
@@ -4933,7 +4910,7 @@
           <w:color w:val="263238"/>
           <w:rtl w:val="1"/>
         </w:rPr>
-        <w:t>•  Request را زیر Features/.../Requests/Commands یا Queries بساز.</w:t>
+        <w:t>•  Request را زیر Features/.../Requests/Commands یا Queries بساز و از IRequest[TResponse] ارث بده.</w:t>
       </w:r>
     </w:p>
     <w:p>
@@ -4948,7 +4925,7 @@
           <w:color w:val="263238"/>
           <w:rtl w:val="1"/>
         </w:rPr>
-        <w:t>•  @request_type را تعیین کن.</w:t>
+        <w:t>•  @request_type(RequestType.COMMAND/QUERY) را تعیین کن؛ این Decorator Policy اجرا را مشخص می‌کند.</w:t>
       </w:r>
     </w:p>
     <w:p>
@@ -4963,7 +4940,7 @@
           <w:color w:val="263238"/>
           <w:rtl w:val="1"/>
         </w:rPr>
-        <w:t>•  Handler را زیر Handlers/Commands یا Queries بساز.</w:t>
+        <w:t>•  Handler را زیر Handlers/Commands یا Queries بساز و خروجی آن را با همان TResponse هماهنگ نگه دار.</w:t>
       </w:r>
     </w:p>
     <w:p>
@@ -4978,7 +4955,7 @@
           <w:color w:val="263238"/>
           <w:rtl w:val="1"/>
         </w:rPr>
-        <w:t>•  @handler_for(RequestType) را روی Handler قرار بده.</w:t>
+        <w:t>•  @handler_for(RequestClass) را روی Handler قرار بده.</w:t>
       </w:r>
     </w:p>
     <w:p>
@@ -5023,7 +5000,7 @@
           <w:color w:val="263238"/>
           <w:rtl w:val="1"/>
         </w:rPr>
-        <w:t>•  در Controller فقط MediatorDependency بگیر و mediator.send(...) را صدا بزن.</w:t>
+        <w:t>•  در Controller فقط MediatorDependency بگیر و mediator.send(...) را صدا بزن؛ IDE باید result را به‌صورت TResponse واقعی تشخیص دهد.</w:t>
       </w:r>
     </w:p>
     <w:p>

</xml_diff>